<commit_message>
Polish proposal pagination and add responsive review fixture
</commit_message>
<xml_diff>
--- a/docs/SAMT_Approval_Proposal.docx
+++ b/docs/SAMT_Approval_Proposal.docx
@@ -3859,6 +3859,7 @@
       <w:pPr>
         <w:keepNext/>
         <w:bidi w:val="1"/>
+        <w:spacing w:after="60"/>
         <w:jc w:val="start"/>
       </w:pPr>
       <w:r>
@@ -3875,6 +3876,7 @@
       <w:pPr>
         <w:keepNext/>
         <w:bidi w:val="1"/>
+        <w:spacing w:after="60"/>
         <w:jc w:val="start"/>
       </w:pPr>
       <w:r>
@@ -3890,6 +3892,7 @@
     <w:p>
       <w:pPr>
         <w:bidi w:val="0"/>
+        <w:spacing w:after="100"/>
         <w:jc w:val="start"/>
       </w:pPr>
       <w:hyperlink r:id="rId9">
@@ -3906,6 +3909,7 @@
       <w:pPr>
         <w:keepNext/>
         <w:bidi w:val="1"/>
+        <w:spacing w:after="60"/>
         <w:jc w:val="start"/>
       </w:pPr>
       <w:r>
@@ -3922,6 +3926,7 @@
       <w:pPr>
         <w:keepNext/>
         <w:bidi w:val="1"/>
+        <w:spacing w:after="60"/>
         <w:jc w:val="start"/>
       </w:pPr>
       <w:r>
@@ -3937,6 +3942,7 @@
     <w:p>
       <w:pPr>
         <w:bidi w:val="0"/>
+        <w:spacing w:after="100"/>
         <w:jc w:val="start"/>
       </w:pPr>
       <w:hyperlink r:id="rId10">
@@ -3953,6 +3959,7 @@
       <w:pPr>
         <w:keepNext/>
         <w:bidi w:val="1"/>
+        <w:spacing w:after="60"/>
         <w:jc w:val="start"/>
       </w:pPr>
       <w:r>
@@ -3969,6 +3976,7 @@
       <w:pPr>
         <w:keepNext/>
         <w:bidi w:val="1"/>
+        <w:spacing w:after="60"/>
         <w:jc w:val="start"/>
       </w:pPr>
       <w:r>
@@ -3984,6 +3992,7 @@
     <w:p>
       <w:pPr>
         <w:bidi w:val="0"/>
+        <w:spacing w:after="100"/>
         <w:jc w:val="start"/>
       </w:pPr>
       <w:hyperlink r:id="rId11">
@@ -4000,6 +4009,7 @@
       <w:pPr>
         <w:keepNext/>
         <w:bidi w:val="1"/>
+        <w:spacing w:after="60"/>
         <w:jc w:val="start"/>
       </w:pPr>
       <w:r>
@@ -4016,6 +4026,7 @@
       <w:pPr>
         <w:keepNext/>
         <w:bidi w:val="1"/>
+        <w:spacing w:after="60"/>
         <w:jc w:val="start"/>
       </w:pPr>
       <w:r>
@@ -4031,6 +4042,7 @@
     <w:p>
       <w:pPr>
         <w:bidi w:val="0"/>
+        <w:spacing w:after="100"/>
         <w:jc w:val="start"/>
       </w:pPr>
       <w:hyperlink r:id="rId12">
@@ -4047,6 +4059,7 @@
       <w:pPr>
         <w:keepNext/>
         <w:bidi w:val="1"/>
+        <w:spacing w:after="60"/>
         <w:jc w:val="start"/>
       </w:pPr>
       <w:r>
@@ -4063,6 +4076,7 @@
       <w:pPr>
         <w:keepNext/>
         <w:bidi w:val="1"/>
+        <w:spacing w:after="60"/>
         <w:jc w:val="start"/>
       </w:pPr>
       <w:r>
@@ -4078,6 +4092,7 @@
     <w:p>
       <w:pPr>
         <w:bidi w:val="0"/>
+        <w:spacing w:after="100"/>
         <w:jc w:val="start"/>
       </w:pPr>
       <w:hyperlink r:id="rId13">
@@ -4094,6 +4109,7 @@
       <w:pPr>
         <w:keepNext/>
         <w:bidi w:val="1"/>
+        <w:spacing w:after="60"/>
         <w:jc w:val="start"/>
       </w:pPr>
       <w:r>
@@ -4110,6 +4126,7 @@
       <w:pPr>
         <w:keepNext/>
         <w:bidi w:val="1"/>
+        <w:spacing w:after="60"/>
         <w:jc w:val="start"/>
       </w:pPr>
       <w:r>
@@ -4125,6 +4142,7 @@
     <w:p>
       <w:pPr>
         <w:bidi w:val="0"/>
+        <w:spacing w:after="100"/>
         <w:jc w:val="start"/>
       </w:pPr>
       <w:hyperlink r:id="rId14">
@@ -4141,6 +4159,7 @@
       <w:pPr>
         <w:keepNext/>
         <w:bidi w:val="1"/>
+        <w:spacing w:after="60"/>
         <w:jc w:val="start"/>
       </w:pPr>
       <w:r>
@@ -4157,6 +4176,7 @@
       <w:pPr>
         <w:keepNext/>
         <w:bidi w:val="1"/>
+        <w:spacing w:after="60"/>
         <w:jc w:val="start"/>
       </w:pPr>
       <w:r>
@@ -4172,6 +4192,7 @@
     <w:p>
       <w:pPr>
         <w:bidi w:val="0"/>
+        <w:spacing w:after="100"/>
         <w:jc w:val="start"/>
       </w:pPr>
       <w:hyperlink r:id="rId15">
@@ -4188,6 +4209,7 @@
       <w:pPr>
         <w:keepNext/>
         <w:bidi w:val="1"/>
+        <w:spacing w:after="60"/>
         <w:jc w:val="start"/>
       </w:pPr>
       <w:r>
@@ -4204,6 +4226,7 @@
       <w:pPr>
         <w:keepNext/>
         <w:bidi w:val="1"/>
+        <w:spacing w:after="60"/>
         <w:jc w:val="start"/>
       </w:pPr>
       <w:r>
@@ -4219,6 +4242,7 @@
     <w:p>
       <w:pPr>
         <w:bidi w:val="0"/>
+        <w:spacing w:after="100"/>
         <w:jc w:val="start"/>
       </w:pPr>
       <w:hyperlink r:id="rId16">
@@ -4235,6 +4259,7 @@
       <w:pPr>
         <w:keepNext/>
         <w:bidi w:val="1"/>
+        <w:spacing w:after="60"/>
         <w:jc w:val="start"/>
       </w:pPr>
       <w:r>
@@ -4251,6 +4276,7 @@
       <w:pPr>
         <w:keepNext/>
         <w:bidi w:val="1"/>
+        <w:spacing w:after="60"/>
         <w:jc w:val="start"/>
       </w:pPr>
       <w:r>
@@ -4266,6 +4292,7 @@
     <w:p>
       <w:pPr>
         <w:bidi w:val="0"/>
+        <w:spacing w:after="100"/>
         <w:jc w:val="start"/>
       </w:pPr>
       <w:hyperlink r:id="rId17">
@@ -4282,6 +4309,7 @@
       <w:pPr>
         <w:keepNext/>
         <w:bidi w:val="1"/>
+        <w:spacing w:after="60"/>
         <w:jc w:val="start"/>
       </w:pPr>
       <w:r>
@@ -4298,6 +4326,7 @@
       <w:pPr>
         <w:keepNext/>
         <w:bidi w:val="1"/>
+        <w:spacing w:after="60"/>
         <w:jc w:val="start"/>
       </w:pPr>
       <w:r>
@@ -4313,6 +4342,7 @@
     <w:p>
       <w:pPr>
         <w:bidi w:val="0"/>
+        <w:spacing w:after="100"/>
         <w:jc w:val="start"/>
       </w:pPr>
       <w:hyperlink r:id="rId18">
@@ -4329,6 +4359,7 @@
       <w:pPr>
         <w:keepNext/>
         <w:bidi w:val="1"/>
+        <w:spacing w:after="60"/>
         <w:jc w:val="start"/>
       </w:pPr>
       <w:r>
@@ -4345,6 +4376,7 @@
       <w:pPr>
         <w:keepNext/>
         <w:bidi w:val="1"/>
+        <w:spacing w:after="60"/>
         <w:jc w:val="start"/>
       </w:pPr>
       <w:r>
@@ -4360,6 +4392,7 @@
     <w:p>
       <w:pPr>
         <w:bidi w:val="0"/>
+        <w:spacing w:after="100"/>
         <w:jc w:val="start"/>
       </w:pPr>
       <w:hyperlink r:id="rId19">
@@ -4376,6 +4409,7 @@
       <w:pPr>
         <w:keepNext/>
         <w:bidi w:val="1"/>
+        <w:spacing w:after="60"/>
         <w:jc w:val="start"/>
       </w:pPr>
       <w:r>
@@ -4392,6 +4426,7 @@
       <w:pPr>
         <w:keepNext/>
         <w:bidi w:val="1"/>
+        <w:spacing w:after="60"/>
         <w:jc w:val="start"/>
       </w:pPr>
       <w:r>
@@ -4407,6 +4442,7 @@
     <w:p>
       <w:pPr>
         <w:bidi w:val="0"/>
+        <w:spacing w:after="100"/>
         <w:jc w:val="start"/>
       </w:pPr>
       <w:hyperlink r:id="rId20">
@@ -8278,6 +8314,7 @@
       <w:pPr>
         <w:keepNext/>
         <w:bidi w:val="0"/>
+        <w:spacing w:after="60"/>
         <w:jc w:val="start"/>
       </w:pPr>
       <w:r>
@@ -8294,6 +8331,7 @@
       <w:pPr>
         <w:keepNext/>
         <w:bidi w:val="0"/>
+        <w:spacing w:after="60"/>
         <w:jc w:val="start"/>
       </w:pPr>
       <w:r>
@@ -8309,6 +8347,7 @@
     <w:p>
       <w:pPr>
         <w:bidi w:val="0"/>
+        <w:spacing w:after="100"/>
         <w:jc w:val="start"/>
       </w:pPr>
       <w:hyperlink r:id="rId9">
@@ -8325,6 +8364,7 @@
       <w:pPr>
         <w:keepNext/>
         <w:bidi w:val="0"/>
+        <w:spacing w:after="60"/>
         <w:jc w:val="start"/>
       </w:pPr>
       <w:r>
@@ -8341,6 +8381,7 @@
       <w:pPr>
         <w:keepNext/>
         <w:bidi w:val="0"/>
+        <w:spacing w:after="60"/>
         <w:jc w:val="start"/>
       </w:pPr>
       <w:r>
@@ -8356,6 +8397,7 @@
     <w:p>
       <w:pPr>
         <w:bidi w:val="0"/>
+        <w:spacing w:after="100"/>
         <w:jc w:val="start"/>
       </w:pPr>
       <w:hyperlink r:id="rId10">
@@ -8372,6 +8414,7 @@
       <w:pPr>
         <w:keepNext/>
         <w:bidi w:val="0"/>
+        <w:spacing w:after="60"/>
         <w:jc w:val="start"/>
       </w:pPr>
       <w:r>
@@ -8388,6 +8431,7 @@
       <w:pPr>
         <w:keepNext/>
         <w:bidi w:val="0"/>
+        <w:spacing w:after="60"/>
         <w:jc w:val="start"/>
       </w:pPr>
       <w:r>
@@ -8403,6 +8447,7 @@
     <w:p>
       <w:pPr>
         <w:bidi w:val="0"/>
+        <w:spacing w:after="100"/>
         <w:jc w:val="start"/>
       </w:pPr>
       <w:hyperlink r:id="rId11">
@@ -8419,6 +8464,7 @@
       <w:pPr>
         <w:keepNext/>
         <w:bidi w:val="0"/>
+        <w:spacing w:after="60"/>
         <w:jc w:val="start"/>
       </w:pPr>
       <w:r>
@@ -8435,6 +8481,7 @@
       <w:pPr>
         <w:keepNext/>
         <w:bidi w:val="0"/>
+        <w:spacing w:after="60"/>
         <w:jc w:val="start"/>
       </w:pPr>
       <w:r>
@@ -8450,6 +8497,7 @@
     <w:p>
       <w:pPr>
         <w:bidi w:val="0"/>
+        <w:spacing w:after="100"/>
         <w:jc w:val="start"/>
       </w:pPr>
       <w:hyperlink r:id="rId12">
@@ -8466,6 +8514,7 @@
       <w:pPr>
         <w:keepNext/>
         <w:bidi w:val="0"/>
+        <w:spacing w:after="60"/>
         <w:jc w:val="start"/>
       </w:pPr>
       <w:r>
@@ -8482,6 +8531,7 @@
       <w:pPr>
         <w:keepNext/>
         <w:bidi w:val="0"/>
+        <w:spacing w:after="60"/>
         <w:jc w:val="start"/>
       </w:pPr>
       <w:r>
@@ -8497,6 +8547,7 @@
     <w:p>
       <w:pPr>
         <w:bidi w:val="0"/>
+        <w:spacing w:after="100"/>
         <w:jc w:val="start"/>
       </w:pPr>
       <w:hyperlink r:id="rId13">
@@ -8513,6 +8564,7 @@
       <w:pPr>
         <w:keepNext/>
         <w:bidi w:val="0"/>
+        <w:spacing w:after="60"/>
         <w:jc w:val="start"/>
       </w:pPr>
       <w:r>
@@ -8529,6 +8581,7 @@
       <w:pPr>
         <w:keepNext/>
         <w:bidi w:val="0"/>
+        <w:spacing w:after="60"/>
         <w:jc w:val="start"/>
       </w:pPr>
       <w:r>
@@ -8544,6 +8597,7 @@
     <w:p>
       <w:pPr>
         <w:bidi w:val="0"/>
+        <w:spacing w:after="100"/>
         <w:jc w:val="start"/>
       </w:pPr>
       <w:hyperlink r:id="rId14">
@@ -8560,6 +8614,7 @@
       <w:pPr>
         <w:keepNext/>
         <w:bidi w:val="0"/>
+        <w:spacing w:after="60"/>
         <w:jc w:val="start"/>
       </w:pPr>
       <w:r>
@@ -8576,6 +8631,7 @@
       <w:pPr>
         <w:keepNext/>
         <w:bidi w:val="0"/>
+        <w:spacing w:after="60"/>
         <w:jc w:val="start"/>
       </w:pPr>
       <w:r>
@@ -8591,6 +8647,7 @@
     <w:p>
       <w:pPr>
         <w:bidi w:val="0"/>
+        <w:spacing w:after="100"/>
         <w:jc w:val="start"/>
       </w:pPr>
       <w:hyperlink r:id="rId15">
@@ -8607,6 +8664,7 @@
       <w:pPr>
         <w:keepNext/>
         <w:bidi w:val="0"/>
+        <w:spacing w:after="60"/>
         <w:jc w:val="start"/>
       </w:pPr>
       <w:r>
@@ -8623,6 +8681,7 @@
       <w:pPr>
         <w:keepNext/>
         <w:bidi w:val="0"/>
+        <w:spacing w:after="60"/>
         <w:jc w:val="start"/>
       </w:pPr>
       <w:r>
@@ -8638,6 +8697,7 @@
     <w:p>
       <w:pPr>
         <w:bidi w:val="0"/>
+        <w:spacing w:after="100"/>
         <w:jc w:val="start"/>
       </w:pPr>
       <w:hyperlink r:id="rId16">
@@ -8654,6 +8714,7 @@
       <w:pPr>
         <w:keepNext/>
         <w:bidi w:val="0"/>
+        <w:spacing w:after="60"/>
         <w:jc w:val="start"/>
       </w:pPr>
       <w:r>
@@ -8670,6 +8731,7 @@
       <w:pPr>
         <w:keepNext/>
         <w:bidi w:val="0"/>
+        <w:spacing w:after="60"/>
         <w:jc w:val="start"/>
       </w:pPr>
       <w:r>
@@ -8685,6 +8747,7 @@
     <w:p>
       <w:pPr>
         <w:bidi w:val="0"/>
+        <w:spacing w:after="100"/>
         <w:jc w:val="start"/>
       </w:pPr>
       <w:hyperlink r:id="rId17">
@@ -8701,6 +8764,7 @@
       <w:pPr>
         <w:keepNext/>
         <w:bidi w:val="0"/>
+        <w:spacing w:after="60"/>
         <w:jc w:val="start"/>
       </w:pPr>
       <w:r>
@@ -8717,6 +8781,7 @@
       <w:pPr>
         <w:keepNext/>
         <w:bidi w:val="0"/>
+        <w:spacing w:after="60"/>
         <w:jc w:val="start"/>
       </w:pPr>
       <w:r>
@@ -8732,6 +8797,7 @@
     <w:p>
       <w:pPr>
         <w:bidi w:val="0"/>
+        <w:spacing w:after="100"/>
         <w:jc w:val="start"/>
       </w:pPr>
       <w:hyperlink r:id="rId18">
@@ -8748,6 +8814,7 @@
       <w:pPr>
         <w:keepNext/>
         <w:bidi w:val="0"/>
+        <w:spacing w:after="60"/>
         <w:jc w:val="start"/>
       </w:pPr>
       <w:r>
@@ -8764,6 +8831,7 @@
       <w:pPr>
         <w:keepNext/>
         <w:bidi w:val="0"/>
+        <w:spacing w:after="60"/>
         <w:jc w:val="start"/>
       </w:pPr>
       <w:r>
@@ -8779,6 +8847,7 @@
     <w:p>
       <w:pPr>
         <w:bidi w:val="0"/>
+        <w:spacing w:after="100"/>
         <w:jc w:val="start"/>
       </w:pPr>
       <w:hyperlink r:id="rId19">
@@ -8795,6 +8864,7 @@
       <w:pPr>
         <w:keepNext/>
         <w:bidi w:val="0"/>
+        <w:spacing w:after="60"/>
         <w:jc w:val="start"/>
       </w:pPr>
       <w:r>
@@ -8811,6 +8881,7 @@
       <w:pPr>
         <w:keepNext/>
         <w:bidi w:val="0"/>
+        <w:spacing w:after="60"/>
         <w:jc w:val="start"/>
       </w:pPr>
       <w:r>
@@ -8826,6 +8897,7 @@
     <w:p>
       <w:pPr>
         <w:bidi w:val="0"/>
+        <w:spacing w:after="100"/>
         <w:jc w:val="start"/>
       </w:pPr>
       <w:hyperlink r:id="rId20">

</xml_diff>